<commit_message>
premier commit sur la branch dev-loss
</commit_message>
<xml_diff>
--- a/public/upload/header_PEV21-09-251305.docx
+++ b/public/upload/header_PEV21-09-251305.docx
@@ -1,6 +1,6 @@
 
 <file path=word/document.xml><?xml version="1.0" encoding="utf-8"?>
-<w:document xmlns:wpc="http://schemas.microsoft.com/office/word/2010/wordprocessingCanvas" xmlns:cx="http://schemas.microsoft.com/office/drawing/2014/chartex" xmlns:cx1="http://schemas.microsoft.com/office/drawing/2015/9/8/chartex" xmlns:cx2="http://schemas.microsoft.com/office/drawing/2015/10/21/chartex" xmlns:cx3="http://schemas.microsoft.com/office/drawing/2016/5/9/chartex" xmlns:cx4="http://schemas.microsoft.com/office/drawing/2016/5/10/chartex" xmlns:cx5="http://schemas.microsoft.com/office/drawing/2016/5/11/chartex" xmlns:cx6="http://schemas.microsoft.com/office/drawing/2016/5/12/chartex" xmlns:cx7="http://schemas.microsoft.com/office/drawing/2016/5/13/chartex" xmlns:cx8="http://schemas.microsoft.com/office/drawing/2016/5/14/chartex" xmlns:mc="http://schemas.openxmlformats.org/markup-compatibility/2006" xmlns:aink="http://schemas.microsoft.com/office/drawing/2016/ink" xmlns:am3d="http://schemas.microsoft.com/office/drawing/2017/model3d" xmlns:o="urn:schemas-microsoft-com:office:office" xmlns:r="http://schemas.openxmlformats.org/officeDocument/2006/relationships" xmlns:m="http://schemas.openxmlformats.org/officeDocument/2006/math" xmlns:v="urn:schemas-microsoft-com:vml" xmlns:wp14="http://schemas.microsoft.com/office/word/2010/wordprocessingDrawing" xmlns:wp="http://schemas.openxmlformats.org/drawingml/2006/wordprocessingDrawing" xmlns:w10="urn:schemas-microsoft-com:office:word" xmlns:w="http://schemas.openxmlformats.org/wordprocessingml/2006/main" xmlns:w14="http://schemas.microsoft.com/office/word/2010/wordml" xmlns:w15="http://schemas.microsoft.com/office/word/2012/wordml" xmlns:w16cid="http://schemas.microsoft.com/office/word/2016/wordml/cid" xmlns:w16se="http://schemas.microsoft.com/office/word/2015/wordml/symex" xmlns:wpg="http://schemas.microsoft.com/office/word/2010/wordprocessingGroup" xmlns:wpi="http://schemas.microsoft.com/office/word/2010/wordprocessingInk" xmlns:wne="http://schemas.microsoft.com/office/word/2006/wordml" xmlns:wps="http://schemas.microsoft.com/office/word/2010/wordprocessingShape" mc:Ignorable="w14 w15 w16se w16cid wp14">
+<w:document xmlns:wpc="http://schemas.microsoft.com/office/word/2010/wordprocessingCanvas" xmlns:cx="http://schemas.microsoft.com/office/drawing/2014/chartex" xmlns:cx1="http://schemas.microsoft.com/office/drawing/2015/9/8/chartex" xmlns:cx2="http://schemas.microsoft.com/office/drawing/2015/10/21/chartex" xmlns:cx3="http://schemas.microsoft.com/office/drawing/2016/5/9/chartex" xmlns:cx4="http://schemas.microsoft.com/office/drawing/2016/5/10/chartex" xmlns:cx5="http://schemas.microsoft.com/office/drawing/2016/5/11/chartex" xmlns:cx6="http://schemas.microsoft.com/office/drawing/2016/5/12/chartex" xmlns:cx7="http://schemas.microsoft.com/office/drawing/2016/5/13/chartex" xmlns:cx8="http://schemas.microsoft.com/office/drawing/2016/5/14/chartex" xmlns:mc="http://schemas.openxmlformats.org/markup-compatibility/2006" xmlns:aink="http://schemas.microsoft.com/office/drawing/2016/ink" xmlns:am3d="http://schemas.microsoft.com/office/drawing/2017/model3d" xmlns:o="urn:schemas-microsoft-com:office:office" xmlns:oel="http://schemas.microsoft.com/office/2019/extlst" xmlns:r="http://schemas.openxmlformats.org/officeDocument/2006/relationships" xmlns:m="http://schemas.openxmlformats.org/officeDocument/2006/math" xmlns:v="urn:schemas-microsoft-com:vml" xmlns:wp14="http://schemas.microsoft.com/office/word/2010/wordprocessingDrawing" xmlns:wp="http://schemas.openxmlformats.org/drawingml/2006/wordprocessingDrawing" xmlns:w10="urn:schemas-microsoft-com:office:word" xmlns:w="http://schemas.openxmlformats.org/wordprocessingml/2006/main" xmlns:w14="http://schemas.microsoft.com/office/word/2010/wordml" xmlns:w15="http://schemas.microsoft.com/office/word/2012/wordml" xmlns:w16cex="http://schemas.microsoft.com/office/word/2018/wordml/cex" xmlns:w16cid="http://schemas.microsoft.com/office/word/2016/wordml/cid" xmlns:w16="http://schemas.microsoft.com/office/word/2018/wordml" xmlns:w16du="http://schemas.microsoft.com/office/word/2023/wordml/word16du" xmlns:w16sdtdh="http://schemas.microsoft.com/office/word/2020/wordml/sdtdatahash" xmlns:w16sdtfl="http://schemas.microsoft.com/office/word/2024/wordml/sdtformatlock" xmlns:w16se="http://schemas.microsoft.com/office/word/2015/wordml/symex" xmlns:wpg="http://schemas.microsoft.com/office/word/2010/wordprocessingGroup" xmlns:wpi="http://schemas.microsoft.com/office/word/2010/wordprocessingInk" xmlns:wne="http://schemas.microsoft.com/office/word/2006/wordml" xmlns:wps="http://schemas.microsoft.com/office/word/2010/wordprocessingShape" mc:Ignorable="w14 w15 w16se w16cid w16 w16cex w16sdtdh w16sdtfl w16du wp14">
   <w:body>
     <w:p>
       <w:pPr>
@@ -16,7 +16,7 @@
           <w:noProof/>
         </w:rPr>
         <w:drawing>
-          <wp:anchor distT="0" distB="0" distL="114300" distR="114300" simplePos="0" relativeHeight="251675136" behindDoc="0" locked="0" layoutInCell="1" allowOverlap="1" wp14:anchorId="2D0789CA" wp14:editId="153DC534">
+          <wp:anchor distT="0" distB="0" distL="114300" distR="114300" simplePos="0" relativeHeight="251675136" behindDoc="0" locked="0" layoutInCell="1" allowOverlap="1" wp14:anchorId="79316ACD" wp14:editId="77DB3653">
             <wp:simplePos x="0" y="0"/>
             <wp:positionH relativeFrom="column">
               <wp:posOffset>8633460</wp:posOffset>
@@ -62,7 +62,7 @@
           <w:noProof/>
         </w:rPr>
         <w:drawing>
-          <wp:anchor distT="0" distB="0" distL="114300" distR="114300" simplePos="0" relativeHeight="251673088" behindDoc="0" locked="0" layoutInCell="1" allowOverlap="1" wp14:anchorId="2D0CC0EA" wp14:editId="5D519A96">
+          <wp:anchor distT="0" distB="0" distL="114300" distR="114300" simplePos="0" relativeHeight="251673088" behindDoc="0" locked="0" layoutInCell="1" allowOverlap="1" wp14:anchorId="2FC01819" wp14:editId="776939FD">
             <wp:simplePos x="0" y="0"/>
             <wp:positionH relativeFrom="column">
               <wp:posOffset>-33020</wp:posOffset>
@@ -209,8 +209,6 @@
           <w:rFonts w:ascii="Times New Roman"/>
         </w:rPr>
       </w:pPr>
-      <w:bookmarkStart w:id="0" w:name="_GoBack"/>
-      <w:bookmarkEnd w:id="0"/>
       <w:r>
         <w:rPr>
           <w:noProof/>
@@ -218,7 +216,7 @@
         <mc:AlternateContent>
           <mc:Choice Requires="wps">
             <w:drawing>
-              <wp:anchor distT="0" distB="0" distL="114300" distR="114300" simplePos="0" relativeHeight="251671040" behindDoc="0" locked="0" layoutInCell="1" allowOverlap="1" wp14:anchorId="6B3F724C" wp14:editId="7C10D108">
+              <wp:anchor distT="0" distB="0" distL="114300" distR="114300" simplePos="0" relativeHeight="251671040" behindDoc="0" locked="0" layoutInCell="1" allowOverlap="1" wp14:anchorId="1AE2A6FC" wp14:editId="042CBFA2">
                 <wp:simplePos x="0" y="0"/>
                 <wp:positionH relativeFrom="column">
                   <wp:posOffset>-300990</wp:posOffset>
@@ -312,7 +310,7 @@
           </mc:Choice>
           <mc:Fallback>
             <w:pict>
-              <v:shape w14:anchorId="6B3F724C" id="Shape 63597" o:spid="_x0000_s1026" style="position:absolute;margin-left:-23.7pt;margin-top:16.25pt;width:857.4pt;height:229.2pt;z-index:251671040;visibility:visible;mso-wrap-style:square;mso-width-percent:0;mso-height-percent:0;mso-wrap-distance-left:9pt;mso-wrap-distance-top:0;mso-wrap-distance-right:9pt;mso-wrap-distance-bottom:0;mso-position-horizontal:absolute;mso-position-horizontal-relative:text;mso-position-vertical:absolute;mso-position-vertical-relative:text;mso-width-percent:0;mso-height-percent:0;mso-width-relative:margin;mso-height-relative:margin;v-text-anchor:top" coordsize="10073640,2697480" o:spt="100" o:gfxdata="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" adj="-11796480,,5400" path="m,l10073640,r,2697480l,2697480,,e" fillcolor="blue" stroked="f" strokeweight="0">
+              <v:shape w14:anchorId="1AE2A6FC" id="Shape 63597" o:spid="_x0000_s1026" style="position:absolute;margin-left:-23.7pt;margin-top:16.25pt;width:857.4pt;height:229.2pt;z-index:251671040;visibility:visible;mso-wrap-style:square;mso-width-percent:0;mso-height-percent:0;mso-wrap-distance-left:9pt;mso-wrap-distance-top:0;mso-wrap-distance-right:9pt;mso-wrap-distance-bottom:0;mso-position-horizontal:absolute;mso-position-horizontal-relative:text;mso-position-vertical:absolute;mso-position-vertical-relative:text;mso-width-percent:0;mso-height-percent:0;mso-width-relative:margin;mso-height-relative:margin;v-text-anchor:top" coordsize="10073640,2697480" o:spt="100" o:gfxdata="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" adj="-11796480,,5400" path="m,l10073640,r,2697480l,2697480,,e" fillcolor="blue" stroked="f" strokeweight="0">
                 <v:stroke miterlimit="83231f" joinstyle="miter"/>
                 <v:formulas/>
                 <v:path arrowok="t" o:connecttype="custom" textboxrect="0,0,10073640,2697480"/>
@@ -369,7 +367,7 @@
           <w:noProof/>
         </w:rPr>
         <w:drawing>
-          <wp:anchor distT="0" distB="0" distL="114300" distR="114300" simplePos="0" relativeHeight="251679232" behindDoc="0" locked="0" layoutInCell="1" allowOverlap="1" wp14:anchorId="65ECC990" wp14:editId="47FD8FA0">
+          <wp:anchor distT="0" distB="0" distL="114300" distR="114300" simplePos="0" relativeHeight="251679232" behindDoc="0" locked="0" layoutInCell="1" allowOverlap="1" wp14:anchorId="43C0522A" wp14:editId="441CE475">
             <wp:simplePos x="0" y="0"/>
             <wp:positionH relativeFrom="column">
               <wp:posOffset>1078230</wp:posOffset>
@@ -451,7 +449,7 @@
           <w:noProof/>
         </w:rPr>
         <w:drawing>
-          <wp:anchor distT="0" distB="0" distL="114300" distR="114300" simplePos="0" relativeHeight="251681280" behindDoc="0" locked="0" layoutInCell="1" allowOverlap="1" wp14:anchorId="1E7868A4" wp14:editId="0C532B15">
+          <wp:anchor distT="0" distB="0" distL="114300" distR="114300" simplePos="0" relativeHeight="251681280" behindDoc="0" locked="0" layoutInCell="1" allowOverlap="1" wp14:anchorId="2375361F" wp14:editId="62AA0007">
             <wp:simplePos x="0" y="0"/>
             <wp:positionH relativeFrom="column">
               <wp:posOffset>2236470</wp:posOffset>
@@ -527,7 +525,7 @@
           <w:noProof/>
         </w:rPr>
         <w:drawing>
-          <wp:anchor distT="0" distB="0" distL="114300" distR="114300" simplePos="0" relativeHeight="251683328" behindDoc="0" locked="0" layoutInCell="1" allowOverlap="1" wp14:anchorId="527888EE" wp14:editId="7529EF72">
+          <wp:anchor distT="0" distB="0" distL="114300" distR="114300" simplePos="0" relativeHeight="251683328" behindDoc="0" locked="0" layoutInCell="1" allowOverlap="1" wp14:anchorId="2ECFF24C" wp14:editId="7A8F1AB5">
             <wp:simplePos x="0" y="0"/>
             <wp:positionH relativeFrom="column">
               <wp:posOffset>3257550</wp:posOffset>
@@ -626,7 +624,7 @@
         <mc:AlternateContent>
           <mc:Choice Requires="wps">
             <w:drawing>
-              <wp:anchor distT="0" distB="0" distL="114300" distR="114300" simplePos="0" relativeHeight="251686400" behindDoc="0" locked="0" layoutInCell="1" allowOverlap="1">
+              <wp:anchor distT="0" distB="0" distL="114300" distR="114300" simplePos="0" relativeHeight="251686400" behindDoc="0" locked="0" layoutInCell="1" allowOverlap="1" wp14:anchorId="5F008E6F" wp14:editId="33651BC1">
                 <wp:simplePos x="0" y="0"/>
                 <wp:positionH relativeFrom="column">
                   <wp:posOffset>2032423</wp:posOffset>
@@ -877,7 +875,7 @@
           </mc:Choice>
           <mc:Fallback>
             <w:pict>
-              <v:rect id="Rectangle 50" o:spid="_x0000_s1027" style="position:absolute;margin-left:160.05pt;margin-top:1.75pt;width:487.8pt;height:45.35pt;z-index:251686400;visibility:visible;mso-wrap-style:square;mso-width-percent:0;mso-height-percent:0;mso-wrap-distance-left:9pt;mso-wrap-distance-top:0;mso-wrap-distance-right:9pt;mso-wrap-distance-bottom:0;mso-position-horizontal:absolute;mso-position-horizontal-relative:text;mso-position-vertical:absolute;mso-position-vertical-relative:text;mso-width-percent:0;mso-height-percent:0;mso-width-relative:margin;mso-height-relative:margin;v-text-anchor:middle" o:gfxdata="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" filled="f" strokecolor="#f79646 [3209]" strokeweight="2pt">
+              <v:rect w14:anchorId="5F008E6F" id="Rectangle 50" o:spid="_x0000_s1027" style="position:absolute;margin-left:160.05pt;margin-top:1.75pt;width:487.8pt;height:45.35pt;z-index:251686400;visibility:visible;mso-wrap-style:square;mso-width-percent:0;mso-height-percent:0;mso-wrap-distance-left:9pt;mso-wrap-distance-top:0;mso-wrap-distance-right:9pt;mso-wrap-distance-bottom:0;mso-position-horizontal:absolute;mso-position-horizontal-relative:text;mso-position-vertical:absolute;mso-position-vertical-relative:text;mso-width-percent:0;mso-height-percent:0;mso-width-relative:margin;mso-height-relative:margin;v-text-anchor:middle" o:gfxdata="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" filled="f" strokecolor="#f79646 [3209]" strokeweight="2pt">
                 <v:textbox>
                   <w:txbxContent>
                     <w:p>
@@ -1190,7 +1188,7 @@
         <mc:AlternateContent>
           <mc:Choice Requires="wpg">
             <w:drawing>
-              <wp:inline distT="0" distB="0" distL="0" distR="0" wp14:anchorId="02B72FA8" wp14:editId="48ABF23C">
+              <wp:inline distT="0" distB="0" distL="0" distR="0" wp14:anchorId="48E69660" wp14:editId="5123C3DB">
                 <wp:extent cx="10172701" cy="861060"/>
                 <wp:effectExtent l="0" t="0" r="0" b="0"/>
                 <wp:docPr id="40" name="Group 38834"/>
@@ -1340,9 +1338,9 @@
     </w:p>
     <w:p>
       <w:pPr>
-        <w:widowControl/>
-        <w:autoSpaceDE/>
-        <w:autoSpaceDN/>
+        <w:tabs>
+          <w:tab w:val="left" w:pos="1047"/>
+        </w:tabs>
         <w:rPr>
           <w:rFonts w:ascii="Times New Roman"/>
         </w:rPr>
@@ -1366,7 +1364,7 @@
 </file>
 
 <file path=word/endnotes.xml><?xml version="1.0" encoding="utf-8"?>
-<w:endnotes xmlns:wpc="http://schemas.microsoft.com/office/word/2010/wordprocessingCanvas" xmlns:cx="http://schemas.microsoft.com/office/drawing/2014/chartex" xmlns:cx1="http://schemas.microsoft.com/office/drawing/2015/9/8/chartex" xmlns:cx2="http://schemas.microsoft.com/office/drawing/2015/10/21/chartex" xmlns:cx3="http://schemas.microsoft.com/office/drawing/2016/5/9/chartex" xmlns:cx4="http://schemas.microsoft.com/office/drawing/2016/5/10/chartex" xmlns:cx5="http://schemas.microsoft.com/office/drawing/2016/5/11/chartex" xmlns:cx6="http://schemas.microsoft.com/office/drawing/2016/5/12/chartex" xmlns:cx7="http://schemas.microsoft.com/office/drawing/2016/5/13/chartex" xmlns:cx8="http://schemas.microsoft.com/office/drawing/2016/5/14/chartex" xmlns:mc="http://schemas.openxmlformats.org/markup-compatibility/2006" xmlns:aink="http://schemas.microsoft.com/office/drawing/2016/ink" xmlns:am3d="http://schemas.microsoft.com/office/drawing/2017/model3d" xmlns:o="urn:schemas-microsoft-com:office:office" xmlns:r="http://schemas.openxmlformats.org/officeDocument/2006/relationships" xmlns:m="http://schemas.openxmlformats.org/officeDocument/2006/math" xmlns:v="urn:schemas-microsoft-com:vml" xmlns:wp14="http://schemas.microsoft.com/office/word/2010/wordprocessingDrawing" xmlns:wp="http://schemas.openxmlformats.org/drawingml/2006/wordprocessingDrawing" xmlns:w10="urn:schemas-microsoft-com:office:word" xmlns:w="http://schemas.openxmlformats.org/wordprocessingml/2006/main" xmlns:w14="http://schemas.microsoft.com/office/word/2010/wordml" xmlns:w15="http://schemas.microsoft.com/office/word/2012/wordml" xmlns:w16cid="http://schemas.microsoft.com/office/word/2016/wordml/cid" xmlns:w16se="http://schemas.microsoft.com/office/word/2015/wordml/symex" xmlns:wpg="http://schemas.microsoft.com/office/word/2010/wordprocessingGroup" xmlns:wpi="http://schemas.microsoft.com/office/word/2010/wordprocessingInk" xmlns:wne="http://schemas.microsoft.com/office/word/2006/wordml" xmlns:wps="http://schemas.microsoft.com/office/word/2010/wordprocessingShape" mc:Ignorable="w14 w15 w16se w16cid wp14">
+<w:endnotes xmlns:wpc="http://schemas.microsoft.com/office/word/2010/wordprocessingCanvas" xmlns:cx="http://schemas.microsoft.com/office/drawing/2014/chartex" xmlns:cx1="http://schemas.microsoft.com/office/drawing/2015/9/8/chartex" xmlns:cx2="http://schemas.microsoft.com/office/drawing/2015/10/21/chartex" xmlns:cx3="http://schemas.microsoft.com/office/drawing/2016/5/9/chartex" xmlns:cx4="http://schemas.microsoft.com/office/drawing/2016/5/10/chartex" xmlns:cx5="http://schemas.microsoft.com/office/drawing/2016/5/11/chartex" xmlns:cx6="http://schemas.microsoft.com/office/drawing/2016/5/12/chartex" xmlns:cx7="http://schemas.microsoft.com/office/drawing/2016/5/13/chartex" xmlns:cx8="http://schemas.microsoft.com/office/drawing/2016/5/14/chartex" xmlns:mc="http://schemas.openxmlformats.org/markup-compatibility/2006" xmlns:aink="http://schemas.microsoft.com/office/drawing/2016/ink" xmlns:am3d="http://schemas.microsoft.com/office/drawing/2017/model3d" xmlns:o="urn:schemas-microsoft-com:office:office" xmlns:oel="http://schemas.microsoft.com/office/2019/extlst" xmlns:r="http://schemas.openxmlformats.org/officeDocument/2006/relationships" xmlns:m="http://schemas.openxmlformats.org/officeDocument/2006/math" xmlns:v="urn:schemas-microsoft-com:vml" xmlns:wp14="http://schemas.microsoft.com/office/word/2010/wordprocessingDrawing" xmlns:wp="http://schemas.openxmlformats.org/drawingml/2006/wordprocessingDrawing" xmlns:w10="urn:schemas-microsoft-com:office:word" xmlns:w="http://schemas.openxmlformats.org/wordprocessingml/2006/main" xmlns:w14="http://schemas.microsoft.com/office/word/2010/wordml" xmlns:w15="http://schemas.microsoft.com/office/word/2012/wordml" xmlns:w16cex="http://schemas.microsoft.com/office/word/2018/wordml/cex" xmlns:w16cid="http://schemas.microsoft.com/office/word/2016/wordml/cid" xmlns:w16="http://schemas.microsoft.com/office/word/2018/wordml" xmlns:w16du="http://schemas.microsoft.com/office/word/2023/wordml/word16du" xmlns:w16sdtdh="http://schemas.microsoft.com/office/word/2020/wordml/sdtdatahash" xmlns:w16sdtfl="http://schemas.microsoft.com/office/word/2024/wordml/sdtformatlock" xmlns:w16se="http://schemas.microsoft.com/office/word/2015/wordml/symex" xmlns:wpg="http://schemas.microsoft.com/office/word/2010/wordprocessingGroup" xmlns:wpi="http://schemas.microsoft.com/office/word/2010/wordprocessingInk" xmlns:wne="http://schemas.microsoft.com/office/word/2006/wordml" xmlns:wps="http://schemas.microsoft.com/office/word/2010/wordprocessingShape" mc:Ignorable="w14 w15 w16se w16cid w16 w16cex w16sdtdh w16sdtfl w16du wp14">
   <w:endnote w:type="separator" w:id="-1">
     <w:p>
       <w:r>
@@ -1385,7 +1383,7 @@
 </file>
 
 <file path=word/footer1.xml><?xml version="1.0" encoding="utf-8"?>
-<w:ftr xmlns:wpc="http://schemas.microsoft.com/office/word/2010/wordprocessingCanvas" xmlns:cx="http://schemas.microsoft.com/office/drawing/2014/chartex" xmlns:cx1="http://schemas.microsoft.com/office/drawing/2015/9/8/chartex" xmlns:cx2="http://schemas.microsoft.com/office/drawing/2015/10/21/chartex" xmlns:cx3="http://schemas.microsoft.com/office/drawing/2016/5/9/chartex" xmlns:cx4="http://schemas.microsoft.com/office/drawing/2016/5/10/chartex" xmlns:cx5="http://schemas.microsoft.com/office/drawing/2016/5/11/chartex" xmlns:cx6="http://schemas.microsoft.com/office/drawing/2016/5/12/chartex" xmlns:cx7="http://schemas.microsoft.com/office/drawing/2016/5/13/chartex" xmlns:cx8="http://schemas.microsoft.com/office/drawing/2016/5/14/chartex" xmlns:mc="http://schemas.openxmlformats.org/markup-compatibility/2006" xmlns:aink="http://schemas.microsoft.com/office/drawing/2016/ink" xmlns:am3d="http://schemas.microsoft.com/office/drawing/2017/model3d" xmlns:o="urn:schemas-microsoft-com:office:office" xmlns:r="http://schemas.openxmlformats.org/officeDocument/2006/relationships" xmlns:m="http://schemas.openxmlformats.org/officeDocument/2006/math" xmlns:v="urn:schemas-microsoft-com:vml" xmlns:wp14="http://schemas.microsoft.com/office/word/2010/wordprocessingDrawing" xmlns:wp="http://schemas.openxmlformats.org/drawingml/2006/wordprocessingDrawing" xmlns:w10="urn:schemas-microsoft-com:office:word" xmlns:w="http://schemas.openxmlformats.org/wordprocessingml/2006/main" xmlns:w14="http://schemas.microsoft.com/office/word/2010/wordml" xmlns:w15="http://schemas.microsoft.com/office/word/2012/wordml" xmlns:w16cid="http://schemas.microsoft.com/office/word/2016/wordml/cid" xmlns:w16se="http://schemas.microsoft.com/office/word/2015/wordml/symex" xmlns:wpg="http://schemas.microsoft.com/office/word/2010/wordprocessingGroup" xmlns:wpi="http://schemas.microsoft.com/office/word/2010/wordprocessingInk" xmlns:wne="http://schemas.microsoft.com/office/word/2006/wordml" xmlns:wps="http://schemas.microsoft.com/office/word/2010/wordprocessingShape" mc:Ignorable="w14 w15 w16se w16cid wp14">
+<w:ftr xmlns:wpc="http://schemas.microsoft.com/office/word/2010/wordprocessingCanvas" xmlns:cx="http://schemas.microsoft.com/office/drawing/2014/chartex" xmlns:cx1="http://schemas.microsoft.com/office/drawing/2015/9/8/chartex" xmlns:cx2="http://schemas.microsoft.com/office/drawing/2015/10/21/chartex" xmlns:cx3="http://schemas.microsoft.com/office/drawing/2016/5/9/chartex" xmlns:cx4="http://schemas.microsoft.com/office/drawing/2016/5/10/chartex" xmlns:cx5="http://schemas.microsoft.com/office/drawing/2016/5/11/chartex" xmlns:cx6="http://schemas.microsoft.com/office/drawing/2016/5/12/chartex" xmlns:cx7="http://schemas.microsoft.com/office/drawing/2016/5/13/chartex" xmlns:cx8="http://schemas.microsoft.com/office/drawing/2016/5/14/chartex" xmlns:mc="http://schemas.openxmlformats.org/markup-compatibility/2006" xmlns:aink="http://schemas.microsoft.com/office/drawing/2016/ink" xmlns:am3d="http://schemas.microsoft.com/office/drawing/2017/model3d" xmlns:o="urn:schemas-microsoft-com:office:office" xmlns:oel="http://schemas.microsoft.com/office/2019/extlst" xmlns:r="http://schemas.openxmlformats.org/officeDocument/2006/relationships" xmlns:m="http://schemas.openxmlformats.org/officeDocument/2006/math" xmlns:v="urn:schemas-microsoft-com:vml" xmlns:wp14="http://schemas.microsoft.com/office/word/2010/wordprocessingDrawing" xmlns:wp="http://schemas.openxmlformats.org/drawingml/2006/wordprocessingDrawing" xmlns:w10="urn:schemas-microsoft-com:office:word" xmlns:w="http://schemas.openxmlformats.org/wordprocessingml/2006/main" xmlns:w14="http://schemas.microsoft.com/office/word/2010/wordml" xmlns:w15="http://schemas.microsoft.com/office/word/2012/wordml" xmlns:w16cex="http://schemas.microsoft.com/office/word/2018/wordml/cex" xmlns:w16cid="http://schemas.microsoft.com/office/word/2016/wordml/cid" xmlns:w16="http://schemas.microsoft.com/office/word/2018/wordml" xmlns:w16du="http://schemas.microsoft.com/office/word/2023/wordml/word16du" xmlns:w16sdtdh="http://schemas.microsoft.com/office/word/2020/wordml/sdtdatahash" xmlns:w16sdtfl="http://schemas.microsoft.com/office/word/2024/wordml/sdtformatlock" xmlns:w16se="http://schemas.microsoft.com/office/word/2015/wordml/symex" xmlns:wpg="http://schemas.microsoft.com/office/word/2010/wordprocessingGroup" xmlns:wpi="http://schemas.microsoft.com/office/word/2010/wordprocessingInk" xmlns:wne="http://schemas.microsoft.com/office/word/2006/wordml" xmlns:wps="http://schemas.microsoft.com/office/word/2010/wordprocessingShape" mc:Ignorable="w14 w15 w16se w16cid w16 w16cex w16sdtdh w16sdtfl w16du wp14">
   <w:p>
     <w:pPr>
       <w:pStyle w:val="Pieddepage"/>
@@ -1395,7 +1393,7 @@
 </file>
 
 <file path=word/footer2.xml><?xml version="1.0" encoding="utf-8"?>
-<w:ftr xmlns:wpc="http://schemas.microsoft.com/office/word/2010/wordprocessingCanvas" xmlns:cx="http://schemas.microsoft.com/office/drawing/2014/chartex" xmlns:cx1="http://schemas.microsoft.com/office/drawing/2015/9/8/chartex" xmlns:cx2="http://schemas.microsoft.com/office/drawing/2015/10/21/chartex" xmlns:cx3="http://schemas.microsoft.com/office/drawing/2016/5/9/chartex" xmlns:cx4="http://schemas.microsoft.com/office/drawing/2016/5/10/chartex" xmlns:cx5="http://schemas.microsoft.com/office/drawing/2016/5/11/chartex" xmlns:cx6="http://schemas.microsoft.com/office/drawing/2016/5/12/chartex" xmlns:cx7="http://schemas.microsoft.com/office/drawing/2016/5/13/chartex" xmlns:cx8="http://schemas.microsoft.com/office/drawing/2016/5/14/chartex" xmlns:mc="http://schemas.openxmlformats.org/markup-compatibility/2006" xmlns:aink="http://schemas.microsoft.com/office/drawing/2016/ink" xmlns:am3d="http://schemas.microsoft.com/office/drawing/2017/model3d" xmlns:o="urn:schemas-microsoft-com:office:office" xmlns:r="http://schemas.openxmlformats.org/officeDocument/2006/relationships" xmlns:m="http://schemas.openxmlformats.org/officeDocument/2006/math" xmlns:v="urn:schemas-microsoft-com:vml" xmlns:wp14="http://schemas.microsoft.com/office/word/2010/wordprocessingDrawing" xmlns:wp="http://schemas.openxmlformats.org/drawingml/2006/wordprocessingDrawing" xmlns:w10="urn:schemas-microsoft-com:office:word" xmlns:w="http://schemas.openxmlformats.org/wordprocessingml/2006/main" xmlns:w14="http://schemas.microsoft.com/office/word/2010/wordml" xmlns:w15="http://schemas.microsoft.com/office/word/2012/wordml" xmlns:w16cid="http://schemas.microsoft.com/office/word/2016/wordml/cid" xmlns:w16se="http://schemas.microsoft.com/office/word/2015/wordml/symex" xmlns:wpg="http://schemas.microsoft.com/office/word/2010/wordprocessingGroup" xmlns:wpi="http://schemas.microsoft.com/office/word/2010/wordprocessingInk" xmlns:wne="http://schemas.microsoft.com/office/word/2006/wordml" xmlns:wps="http://schemas.microsoft.com/office/word/2010/wordprocessingShape" mc:Ignorable="w14 w15 w16se w16cid wp14">
+<w:ftr xmlns:wpc="http://schemas.microsoft.com/office/word/2010/wordprocessingCanvas" xmlns:cx="http://schemas.microsoft.com/office/drawing/2014/chartex" xmlns:cx1="http://schemas.microsoft.com/office/drawing/2015/9/8/chartex" xmlns:cx2="http://schemas.microsoft.com/office/drawing/2015/10/21/chartex" xmlns:cx3="http://schemas.microsoft.com/office/drawing/2016/5/9/chartex" xmlns:cx4="http://schemas.microsoft.com/office/drawing/2016/5/10/chartex" xmlns:cx5="http://schemas.microsoft.com/office/drawing/2016/5/11/chartex" xmlns:cx6="http://schemas.microsoft.com/office/drawing/2016/5/12/chartex" xmlns:cx7="http://schemas.microsoft.com/office/drawing/2016/5/13/chartex" xmlns:cx8="http://schemas.microsoft.com/office/drawing/2016/5/14/chartex" xmlns:mc="http://schemas.openxmlformats.org/markup-compatibility/2006" xmlns:aink="http://schemas.microsoft.com/office/drawing/2016/ink" xmlns:am3d="http://schemas.microsoft.com/office/drawing/2017/model3d" xmlns:o="urn:schemas-microsoft-com:office:office" xmlns:oel="http://schemas.microsoft.com/office/2019/extlst" xmlns:r="http://schemas.openxmlformats.org/officeDocument/2006/relationships" xmlns:m="http://schemas.openxmlformats.org/officeDocument/2006/math" xmlns:v="urn:schemas-microsoft-com:vml" xmlns:wp14="http://schemas.microsoft.com/office/word/2010/wordprocessingDrawing" xmlns:wp="http://schemas.openxmlformats.org/drawingml/2006/wordprocessingDrawing" xmlns:w10="urn:schemas-microsoft-com:office:word" xmlns:w="http://schemas.openxmlformats.org/wordprocessingml/2006/main" xmlns:w14="http://schemas.microsoft.com/office/word/2010/wordml" xmlns:w15="http://schemas.microsoft.com/office/word/2012/wordml" xmlns:w16cex="http://schemas.microsoft.com/office/word/2018/wordml/cex" xmlns:w16cid="http://schemas.microsoft.com/office/word/2016/wordml/cid" xmlns:w16="http://schemas.microsoft.com/office/word/2018/wordml" xmlns:w16du="http://schemas.microsoft.com/office/word/2023/wordml/word16du" xmlns:w16sdtdh="http://schemas.microsoft.com/office/word/2020/wordml/sdtdatahash" xmlns:w16sdtfl="http://schemas.microsoft.com/office/word/2024/wordml/sdtformatlock" xmlns:w16se="http://schemas.microsoft.com/office/word/2015/wordml/symex" xmlns:wpg="http://schemas.microsoft.com/office/word/2010/wordprocessingGroup" xmlns:wpi="http://schemas.microsoft.com/office/word/2010/wordprocessingInk" xmlns:wne="http://schemas.microsoft.com/office/word/2006/wordml" xmlns:wps="http://schemas.microsoft.com/office/word/2010/wordprocessingShape" mc:Ignorable="w14 w15 w16se w16cid w16 w16cex w16sdtdh w16sdtfl w16du wp14">
   <w:p>
     <w:pPr>
       <w:pStyle w:val="Corpsdetexte"/>
@@ -1408,7 +1406,7 @@
       <mc:AlternateContent>
         <mc:Choice Requires="wps">
           <w:drawing>
-            <wp:anchor distT="0" distB="0" distL="114300" distR="114300" simplePos="0" relativeHeight="251657728" behindDoc="1" locked="0" layoutInCell="1" allowOverlap="1">
+            <wp:anchor distT="0" distB="0" distL="114300" distR="114300" simplePos="0" relativeHeight="251657728" behindDoc="1" locked="0" layoutInCell="1" allowOverlap="1" wp14:anchorId="010D282E" wp14:editId="70CB1BEA">
               <wp:simplePos x="0" y="0"/>
               <wp:positionH relativeFrom="page">
                 <wp:posOffset>6602730</wp:posOffset>
@@ -1604,11 +1602,11 @@
         </mc:Choice>
         <mc:Fallback>
           <w:pict>
-            <v:shapetype id="_x0000_t202" coordsize="21600,21600" o:spt="202" path="m,l,21600r21600,l21600,xe">
+            <v:shapetype w14:anchorId="010D282E" id="_x0000_t202" coordsize="21600,21600" o:spt="202" path="m,l,21600r21600,l21600,xe">
               <v:stroke joinstyle="miter"/>
               <v:path gradientshapeok="t" o:connecttype="rect"/>
             </v:shapetype>
-            <v:shape id="docshape41" o:spid="_x0000_s1028" type="#_x0000_t202" style="position:absolute;margin-left:519.9pt;margin-top:803.85pt;width:47.1pt;height:11.8pt;z-index:-251658752;visibility:visible;mso-wrap-style:square;mso-width-percent:0;mso-height-percent:0;mso-wrap-distance-left:9pt;mso-wrap-distance-top:0;mso-wrap-distance-right:9pt;mso-wrap-distance-bottom:0;mso-position-horizontal:absolute;mso-position-horizontal-relative:page;mso-position-vertical:absolute;mso-position-vertical-relative:page;mso-width-percent:0;mso-height-percent:0;mso-width-relative:page;mso-height-relative:page;v-text-anchor:top" o:gfxdata="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" filled="f" stroked="f">
+            <v:shape id="docshape41" o:spid="_x0000_s1028" type="#_x0000_t202" style="position:absolute;margin-left:519.9pt;margin-top:803.85pt;width:47.1pt;height:11.8pt;z-index:-251658752;visibility:visible;mso-wrap-style:square;mso-width-percent:0;mso-height-percent:0;mso-wrap-distance-left:9pt;mso-wrap-distance-top:0;mso-wrap-distance-right:9pt;mso-wrap-distance-bottom:0;mso-position-horizontal:absolute;mso-position-horizontal-relative:page;mso-position-vertical:absolute;mso-position-vertical-relative:page;mso-width-percent:0;mso-height-percent:0;mso-width-relative:page;mso-height-relative:page;v-text-anchor:top" o:gfxdata="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" filled="f" stroked="f">
               <v:textbox inset="0,0,0,0">
                 <w:txbxContent>
                   <w:p>
@@ -1746,7 +1744,7 @@
 </file>
 
 <file path=word/footer3.xml><?xml version="1.0" encoding="utf-8"?>
-<w:ftr xmlns:wpc="http://schemas.microsoft.com/office/word/2010/wordprocessingCanvas" xmlns:cx="http://schemas.microsoft.com/office/drawing/2014/chartex" xmlns:cx1="http://schemas.microsoft.com/office/drawing/2015/9/8/chartex" xmlns:cx2="http://schemas.microsoft.com/office/drawing/2015/10/21/chartex" xmlns:cx3="http://schemas.microsoft.com/office/drawing/2016/5/9/chartex" xmlns:cx4="http://schemas.microsoft.com/office/drawing/2016/5/10/chartex" xmlns:cx5="http://schemas.microsoft.com/office/drawing/2016/5/11/chartex" xmlns:cx6="http://schemas.microsoft.com/office/drawing/2016/5/12/chartex" xmlns:cx7="http://schemas.microsoft.com/office/drawing/2016/5/13/chartex" xmlns:cx8="http://schemas.microsoft.com/office/drawing/2016/5/14/chartex" xmlns:mc="http://schemas.openxmlformats.org/markup-compatibility/2006" xmlns:aink="http://schemas.microsoft.com/office/drawing/2016/ink" xmlns:am3d="http://schemas.microsoft.com/office/drawing/2017/model3d" xmlns:o="urn:schemas-microsoft-com:office:office" xmlns:r="http://schemas.openxmlformats.org/officeDocument/2006/relationships" xmlns:m="http://schemas.openxmlformats.org/officeDocument/2006/math" xmlns:v="urn:schemas-microsoft-com:vml" xmlns:wp14="http://schemas.microsoft.com/office/word/2010/wordprocessingDrawing" xmlns:wp="http://schemas.openxmlformats.org/drawingml/2006/wordprocessingDrawing" xmlns:w10="urn:schemas-microsoft-com:office:word" xmlns:w="http://schemas.openxmlformats.org/wordprocessingml/2006/main" xmlns:w14="http://schemas.microsoft.com/office/word/2010/wordml" xmlns:w15="http://schemas.microsoft.com/office/word/2012/wordml" xmlns:w16cid="http://schemas.microsoft.com/office/word/2016/wordml/cid" xmlns:w16se="http://schemas.microsoft.com/office/word/2015/wordml/symex" xmlns:wpg="http://schemas.microsoft.com/office/word/2010/wordprocessingGroup" xmlns:wpi="http://schemas.microsoft.com/office/word/2010/wordprocessingInk" xmlns:wne="http://schemas.microsoft.com/office/word/2006/wordml" xmlns:wps="http://schemas.microsoft.com/office/word/2010/wordprocessingShape" mc:Ignorable="w14 w15 w16se w16cid wp14">
+<w:ftr xmlns:wpc="http://schemas.microsoft.com/office/word/2010/wordprocessingCanvas" xmlns:cx="http://schemas.microsoft.com/office/drawing/2014/chartex" xmlns:cx1="http://schemas.microsoft.com/office/drawing/2015/9/8/chartex" xmlns:cx2="http://schemas.microsoft.com/office/drawing/2015/10/21/chartex" xmlns:cx3="http://schemas.microsoft.com/office/drawing/2016/5/9/chartex" xmlns:cx4="http://schemas.microsoft.com/office/drawing/2016/5/10/chartex" xmlns:cx5="http://schemas.microsoft.com/office/drawing/2016/5/11/chartex" xmlns:cx6="http://schemas.microsoft.com/office/drawing/2016/5/12/chartex" xmlns:cx7="http://schemas.microsoft.com/office/drawing/2016/5/13/chartex" xmlns:cx8="http://schemas.microsoft.com/office/drawing/2016/5/14/chartex" xmlns:mc="http://schemas.openxmlformats.org/markup-compatibility/2006" xmlns:aink="http://schemas.microsoft.com/office/drawing/2016/ink" xmlns:am3d="http://schemas.microsoft.com/office/drawing/2017/model3d" xmlns:o="urn:schemas-microsoft-com:office:office" xmlns:oel="http://schemas.microsoft.com/office/2019/extlst" xmlns:r="http://schemas.openxmlformats.org/officeDocument/2006/relationships" xmlns:m="http://schemas.openxmlformats.org/officeDocument/2006/math" xmlns:v="urn:schemas-microsoft-com:vml" xmlns:wp14="http://schemas.microsoft.com/office/word/2010/wordprocessingDrawing" xmlns:wp="http://schemas.openxmlformats.org/drawingml/2006/wordprocessingDrawing" xmlns:w10="urn:schemas-microsoft-com:office:word" xmlns:w="http://schemas.openxmlformats.org/wordprocessingml/2006/main" xmlns:w14="http://schemas.microsoft.com/office/word/2010/wordml" xmlns:w15="http://schemas.microsoft.com/office/word/2012/wordml" xmlns:w16cex="http://schemas.microsoft.com/office/word/2018/wordml/cex" xmlns:w16cid="http://schemas.microsoft.com/office/word/2016/wordml/cid" xmlns:w16="http://schemas.microsoft.com/office/word/2018/wordml" xmlns:w16du="http://schemas.microsoft.com/office/word/2023/wordml/word16du" xmlns:w16sdtdh="http://schemas.microsoft.com/office/word/2020/wordml/sdtdatahash" xmlns:w16sdtfl="http://schemas.microsoft.com/office/word/2024/wordml/sdtformatlock" xmlns:w16se="http://schemas.microsoft.com/office/word/2015/wordml/symex" xmlns:wpg="http://schemas.microsoft.com/office/word/2010/wordprocessingGroup" xmlns:wpi="http://schemas.microsoft.com/office/word/2010/wordprocessingInk" xmlns:wne="http://schemas.microsoft.com/office/word/2006/wordml" xmlns:wps="http://schemas.microsoft.com/office/word/2010/wordprocessingShape" mc:Ignorable="w14 w15 w16se w16cid w16 w16cex w16sdtdh w16sdtfl w16du wp14">
   <w:p>
     <w:pPr>
       <w:pStyle w:val="Pieddepage"/>
@@ -1756,7 +1754,7 @@
 </file>
 
 <file path=word/footnotes.xml><?xml version="1.0" encoding="utf-8"?>
-<w:footnotes xmlns:wpc="http://schemas.microsoft.com/office/word/2010/wordprocessingCanvas" xmlns:cx="http://schemas.microsoft.com/office/drawing/2014/chartex" xmlns:cx1="http://schemas.microsoft.com/office/drawing/2015/9/8/chartex" xmlns:cx2="http://schemas.microsoft.com/office/drawing/2015/10/21/chartex" xmlns:cx3="http://schemas.microsoft.com/office/drawing/2016/5/9/chartex" xmlns:cx4="http://schemas.microsoft.com/office/drawing/2016/5/10/chartex" xmlns:cx5="http://schemas.microsoft.com/office/drawing/2016/5/11/chartex" xmlns:cx6="http://schemas.microsoft.com/office/drawing/2016/5/12/chartex" xmlns:cx7="http://schemas.microsoft.com/office/drawing/2016/5/13/chartex" xmlns:cx8="http://schemas.microsoft.com/office/drawing/2016/5/14/chartex" xmlns:mc="http://schemas.openxmlformats.org/markup-compatibility/2006" xmlns:aink="http://schemas.microsoft.com/office/drawing/2016/ink" xmlns:am3d="http://schemas.microsoft.com/office/drawing/2017/model3d" xmlns:o="urn:schemas-microsoft-com:office:office" xmlns:r="http://schemas.openxmlformats.org/officeDocument/2006/relationships" xmlns:m="http://schemas.openxmlformats.org/officeDocument/2006/math" xmlns:v="urn:schemas-microsoft-com:vml" xmlns:wp14="http://schemas.microsoft.com/office/word/2010/wordprocessingDrawing" xmlns:wp="http://schemas.openxmlformats.org/drawingml/2006/wordprocessingDrawing" xmlns:w10="urn:schemas-microsoft-com:office:word" xmlns:w="http://schemas.openxmlformats.org/wordprocessingml/2006/main" xmlns:w14="http://schemas.microsoft.com/office/word/2010/wordml" xmlns:w15="http://schemas.microsoft.com/office/word/2012/wordml" xmlns:w16cid="http://schemas.microsoft.com/office/word/2016/wordml/cid" xmlns:w16se="http://schemas.microsoft.com/office/word/2015/wordml/symex" xmlns:wpg="http://schemas.microsoft.com/office/word/2010/wordprocessingGroup" xmlns:wpi="http://schemas.microsoft.com/office/word/2010/wordprocessingInk" xmlns:wne="http://schemas.microsoft.com/office/word/2006/wordml" xmlns:wps="http://schemas.microsoft.com/office/word/2010/wordprocessingShape" mc:Ignorable="w14 w15 w16se w16cid wp14">
+<w:footnotes xmlns:wpc="http://schemas.microsoft.com/office/word/2010/wordprocessingCanvas" xmlns:cx="http://schemas.microsoft.com/office/drawing/2014/chartex" xmlns:cx1="http://schemas.microsoft.com/office/drawing/2015/9/8/chartex" xmlns:cx2="http://schemas.microsoft.com/office/drawing/2015/10/21/chartex" xmlns:cx3="http://schemas.microsoft.com/office/drawing/2016/5/9/chartex" xmlns:cx4="http://schemas.microsoft.com/office/drawing/2016/5/10/chartex" xmlns:cx5="http://schemas.microsoft.com/office/drawing/2016/5/11/chartex" xmlns:cx6="http://schemas.microsoft.com/office/drawing/2016/5/12/chartex" xmlns:cx7="http://schemas.microsoft.com/office/drawing/2016/5/13/chartex" xmlns:cx8="http://schemas.microsoft.com/office/drawing/2016/5/14/chartex" xmlns:mc="http://schemas.openxmlformats.org/markup-compatibility/2006" xmlns:aink="http://schemas.microsoft.com/office/drawing/2016/ink" xmlns:am3d="http://schemas.microsoft.com/office/drawing/2017/model3d" xmlns:o="urn:schemas-microsoft-com:office:office" xmlns:oel="http://schemas.microsoft.com/office/2019/extlst" xmlns:r="http://schemas.openxmlformats.org/officeDocument/2006/relationships" xmlns:m="http://schemas.openxmlformats.org/officeDocument/2006/math" xmlns:v="urn:schemas-microsoft-com:vml" xmlns:wp14="http://schemas.microsoft.com/office/word/2010/wordprocessingDrawing" xmlns:wp="http://schemas.openxmlformats.org/drawingml/2006/wordprocessingDrawing" xmlns:w10="urn:schemas-microsoft-com:office:word" xmlns:w="http://schemas.openxmlformats.org/wordprocessingml/2006/main" xmlns:w14="http://schemas.microsoft.com/office/word/2010/wordml" xmlns:w15="http://schemas.microsoft.com/office/word/2012/wordml" xmlns:w16cex="http://schemas.microsoft.com/office/word/2018/wordml/cex" xmlns:w16cid="http://schemas.microsoft.com/office/word/2016/wordml/cid" xmlns:w16="http://schemas.microsoft.com/office/word/2018/wordml" xmlns:w16du="http://schemas.microsoft.com/office/word/2023/wordml/word16du" xmlns:w16sdtdh="http://schemas.microsoft.com/office/word/2020/wordml/sdtdatahash" xmlns:w16sdtfl="http://schemas.microsoft.com/office/word/2024/wordml/sdtformatlock" xmlns:w16se="http://schemas.microsoft.com/office/word/2015/wordml/symex" xmlns:wpg="http://schemas.microsoft.com/office/word/2010/wordprocessingGroup" xmlns:wpi="http://schemas.microsoft.com/office/word/2010/wordprocessingInk" xmlns:wne="http://schemas.microsoft.com/office/word/2006/wordml" xmlns:wps="http://schemas.microsoft.com/office/word/2010/wordprocessingShape" mc:Ignorable="w14 w15 w16se w16cid w16 w16cex w16sdtdh w16sdtfl w16du wp14">
   <w:footnote w:type="separator" w:id="-1">
     <w:p>
       <w:r>
@@ -1775,7 +1773,7 @@
 </file>
 
 <file path=word/header1.xml><?xml version="1.0" encoding="utf-8"?>
-<w:hdr xmlns:wpc="http://schemas.microsoft.com/office/word/2010/wordprocessingCanvas" xmlns:cx="http://schemas.microsoft.com/office/drawing/2014/chartex" xmlns:cx1="http://schemas.microsoft.com/office/drawing/2015/9/8/chartex" xmlns:cx2="http://schemas.microsoft.com/office/drawing/2015/10/21/chartex" xmlns:cx3="http://schemas.microsoft.com/office/drawing/2016/5/9/chartex" xmlns:cx4="http://schemas.microsoft.com/office/drawing/2016/5/10/chartex" xmlns:cx5="http://schemas.microsoft.com/office/drawing/2016/5/11/chartex" xmlns:cx6="http://schemas.microsoft.com/office/drawing/2016/5/12/chartex" xmlns:cx7="http://schemas.microsoft.com/office/drawing/2016/5/13/chartex" xmlns:cx8="http://schemas.microsoft.com/office/drawing/2016/5/14/chartex" xmlns:mc="http://schemas.openxmlformats.org/markup-compatibility/2006" xmlns:aink="http://schemas.microsoft.com/office/drawing/2016/ink" xmlns:am3d="http://schemas.microsoft.com/office/drawing/2017/model3d" xmlns:o="urn:schemas-microsoft-com:office:office" xmlns:r="http://schemas.openxmlformats.org/officeDocument/2006/relationships" xmlns:m="http://schemas.openxmlformats.org/officeDocument/2006/math" xmlns:v="urn:schemas-microsoft-com:vml" xmlns:wp14="http://schemas.microsoft.com/office/word/2010/wordprocessingDrawing" xmlns:wp="http://schemas.openxmlformats.org/drawingml/2006/wordprocessingDrawing" xmlns:w10="urn:schemas-microsoft-com:office:word" xmlns:w="http://schemas.openxmlformats.org/wordprocessingml/2006/main" xmlns:w14="http://schemas.microsoft.com/office/word/2010/wordml" xmlns:w15="http://schemas.microsoft.com/office/word/2012/wordml" xmlns:w16cid="http://schemas.microsoft.com/office/word/2016/wordml/cid" xmlns:w16se="http://schemas.microsoft.com/office/word/2015/wordml/symex" xmlns:wpg="http://schemas.microsoft.com/office/word/2010/wordprocessingGroup" xmlns:wpi="http://schemas.microsoft.com/office/word/2010/wordprocessingInk" xmlns:wne="http://schemas.microsoft.com/office/word/2006/wordml" xmlns:wps="http://schemas.microsoft.com/office/word/2010/wordprocessingShape" mc:Ignorable="w14 w15 w16se w16cid wp14">
+<w:hdr xmlns:wpc="http://schemas.microsoft.com/office/word/2010/wordprocessingCanvas" xmlns:cx="http://schemas.microsoft.com/office/drawing/2014/chartex" xmlns:cx1="http://schemas.microsoft.com/office/drawing/2015/9/8/chartex" xmlns:cx2="http://schemas.microsoft.com/office/drawing/2015/10/21/chartex" xmlns:cx3="http://schemas.microsoft.com/office/drawing/2016/5/9/chartex" xmlns:cx4="http://schemas.microsoft.com/office/drawing/2016/5/10/chartex" xmlns:cx5="http://schemas.microsoft.com/office/drawing/2016/5/11/chartex" xmlns:cx6="http://schemas.microsoft.com/office/drawing/2016/5/12/chartex" xmlns:cx7="http://schemas.microsoft.com/office/drawing/2016/5/13/chartex" xmlns:cx8="http://schemas.microsoft.com/office/drawing/2016/5/14/chartex" xmlns:mc="http://schemas.openxmlformats.org/markup-compatibility/2006" xmlns:aink="http://schemas.microsoft.com/office/drawing/2016/ink" xmlns:am3d="http://schemas.microsoft.com/office/drawing/2017/model3d" xmlns:o="urn:schemas-microsoft-com:office:office" xmlns:oel="http://schemas.microsoft.com/office/2019/extlst" xmlns:r="http://schemas.openxmlformats.org/officeDocument/2006/relationships" xmlns:m="http://schemas.openxmlformats.org/officeDocument/2006/math" xmlns:v="urn:schemas-microsoft-com:vml" xmlns:wp14="http://schemas.microsoft.com/office/word/2010/wordprocessingDrawing" xmlns:wp="http://schemas.openxmlformats.org/drawingml/2006/wordprocessingDrawing" xmlns:w10="urn:schemas-microsoft-com:office:word" xmlns:w="http://schemas.openxmlformats.org/wordprocessingml/2006/main" xmlns:w14="http://schemas.microsoft.com/office/word/2010/wordml" xmlns:w15="http://schemas.microsoft.com/office/word/2012/wordml" xmlns:w16cex="http://schemas.microsoft.com/office/word/2018/wordml/cex" xmlns:w16cid="http://schemas.microsoft.com/office/word/2016/wordml/cid" xmlns:w16="http://schemas.microsoft.com/office/word/2018/wordml" xmlns:w16du="http://schemas.microsoft.com/office/word/2023/wordml/word16du" xmlns:w16sdtdh="http://schemas.microsoft.com/office/word/2020/wordml/sdtdatahash" xmlns:w16sdtfl="http://schemas.microsoft.com/office/word/2024/wordml/sdtformatlock" xmlns:w16se="http://schemas.microsoft.com/office/word/2015/wordml/symex" xmlns:wpg="http://schemas.microsoft.com/office/word/2010/wordprocessingGroup" xmlns:wpi="http://schemas.microsoft.com/office/word/2010/wordprocessingInk" xmlns:wne="http://schemas.microsoft.com/office/word/2006/wordml" xmlns:wps="http://schemas.microsoft.com/office/word/2010/wordprocessingShape" mc:Ignorable="w14 w15 w16se w16cid w16 w16cex w16sdtdh w16sdtfl w16du wp14">
   <w:p>
     <w:pPr>
       <w:pStyle w:val="En-tte"/>
@@ -1785,7 +1783,7 @@
 </file>
 
 <file path=word/header2.xml><?xml version="1.0" encoding="utf-8"?>
-<w:hdr xmlns:wpc="http://schemas.microsoft.com/office/word/2010/wordprocessingCanvas" xmlns:cx="http://schemas.microsoft.com/office/drawing/2014/chartex" xmlns:cx1="http://schemas.microsoft.com/office/drawing/2015/9/8/chartex" xmlns:cx2="http://schemas.microsoft.com/office/drawing/2015/10/21/chartex" xmlns:cx3="http://schemas.microsoft.com/office/drawing/2016/5/9/chartex" xmlns:cx4="http://schemas.microsoft.com/office/drawing/2016/5/10/chartex" xmlns:cx5="http://schemas.microsoft.com/office/drawing/2016/5/11/chartex" xmlns:cx6="http://schemas.microsoft.com/office/drawing/2016/5/12/chartex" xmlns:cx7="http://schemas.microsoft.com/office/drawing/2016/5/13/chartex" xmlns:cx8="http://schemas.microsoft.com/office/drawing/2016/5/14/chartex" xmlns:mc="http://schemas.openxmlformats.org/markup-compatibility/2006" xmlns:aink="http://schemas.microsoft.com/office/drawing/2016/ink" xmlns:am3d="http://schemas.microsoft.com/office/drawing/2017/model3d" xmlns:o="urn:schemas-microsoft-com:office:office" xmlns:r="http://schemas.openxmlformats.org/officeDocument/2006/relationships" xmlns:m="http://schemas.openxmlformats.org/officeDocument/2006/math" xmlns:v="urn:schemas-microsoft-com:vml" xmlns:wp14="http://schemas.microsoft.com/office/word/2010/wordprocessingDrawing" xmlns:wp="http://schemas.openxmlformats.org/drawingml/2006/wordprocessingDrawing" xmlns:w10="urn:schemas-microsoft-com:office:word" xmlns:w="http://schemas.openxmlformats.org/wordprocessingml/2006/main" xmlns:w14="http://schemas.microsoft.com/office/word/2010/wordml" xmlns:w15="http://schemas.microsoft.com/office/word/2012/wordml" xmlns:w16cid="http://schemas.microsoft.com/office/word/2016/wordml/cid" xmlns:w16se="http://schemas.microsoft.com/office/word/2015/wordml/symex" xmlns:wpg="http://schemas.microsoft.com/office/word/2010/wordprocessingGroup" xmlns:wpi="http://schemas.microsoft.com/office/word/2010/wordprocessingInk" xmlns:wne="http://schemas.microsoft.com/office/word/2006/wordml" xmlns:wps="http://schemas.microsoft.com/office/word/2010/wordprocessingShape" mc:Ignorable="w14 w15 w16se w16cid wp14">
+<w:hdr xmlns:wpc="http://schemas.microsoft.com/office/word/2010/wordprocessingCanvas" xmlns:cx="http://schemas.microsoft.com/office/drawing/2014/chartex" xmlns:cx1="http://schemas.microsoft.com/office/drawing/2015/9/8/chartex" xmlns:cx2="http://schemas.microsoft.com/office/drawing/2015/10/21/chartex" xmlns:cx3="http://schemas.microsoft.com/office/drawing/2016/5/9/chartex" xmlns:cx4="http://schemas.microsoft.com/office/drawing/2016/5/10/chartex" xmlns:cx5="http://schemas.microsoft.com/office/drawing/2016/5/11/chartex" xmlns:cx6="http://schemas.microsoft.com/office/drawing/2016/5/12/chartex" xmlns:cx7="http://schemas.microsoft.com/office/drawing/2016/5/13/chartex" xmlns:cx8="http://schemas.microsoft.com/office/drawing/2016/5/14/chartex" xmlns:mc="http://schemas.openxmlformats.org/markup-compatibility/2006" xmlns:aink="http://schemas.microsoft.com/office/drawing/2016/ink" xmlns:am3d="http://schemas.microsoft.com/office/drawing/2017/model3d" xmlns:o="urn:schemas-microsoft-com:office:office" xmlns:oel="http://schemas.microsoft.com/office/2019/extlst" xmlns:r="http://schemas.openxmlformats.org/officeDocument/2006/relationships" xmlns:m="http://schemas.openxmlformats.org/officeDocument/2006/math" xmlns:v="urn:schemas-microsoft-com:vml" xmlns:wp14="http://schemas.microsoft.com/office/word/2010/wordprocessingDrawing" xmlns:wp="http://schemas.openxmlformats.org/drawingml/2006/wordprocessingDrawing" xmlns:w10="urn:schemas-microsoft-com:office:word" xmlns:w="http://schemas.openxmlformats.org/wordprocessingml/2006/main" xmlns:w14="http://schemas.microsoft.com/office/word/2010/wordml" xmlns:w15="http://schemas.microsoft.com/office/word/2012/wordml" xmlns:w16cex="http://schemas.microsoft.com/office/word/2018/wordml/cex" xmlns:w16cid="http://schemas.microsoft.com/office/word/2016/wordml/cid" xmlns:w16="http://schemas.microsoft.com/office/word/2018/wordml" xmlns:w16du="http://schemas.microsoft.com/office/word/2023/wordml/word16du" xmlns:w16sdtdh="http://schemas.microsoft.com/office/word/2020/wordml/sdtdatahash" xmlns:w16sdtfl="http://schemas.microsoft.com/office/word/2024/wordml/sdtformatlock" xmlns:w16se="http://schemas.microsoft.com/office/word/2015/wordml/symex" xmlns:wpg="http://schemas.microsoft.com/office/word/2010/wordprocessingGroup" xmlns:wpi="http://schemas.microsoft.com/office/word/2010/wordprocessingInk" xmlns:wne="http://schemas.microsoft.com/office/word/2006/wordml" xmlns:wps="http://schemas.microsoft.com/office/word/2010/wordprocessingShape" mc:Ignorable="w14 w15 w16se w16cid w16 w16cex w16sdtdh w16sdtfl w16du wp14">
   <w:p>
     <w:pPr>
       <w:pStyle w:val="Corpsdetexte"/>
@@ -1799,7 +1797,7 @@
 </file>
 
 <file path=word/header3.xml><?xml version="1.0" encoding="utf-8"?>
-<w:hdr xmlns:wpc="http://schemas.microsoft.com/office/word/2010/wordprocessingCanvas" xmlns:cx="http://schemas.microsoft.com/office/drawing/2014/chartex" xmlns:cx1="http://schemas.microsoft.com/office/drawing/2015/9/8/chartex" xmlns:cx2="http://schemas.microsoft.com/office/drawing/2015/10/21/chartex" xmlns:cx3="http://schemas.microsoft.com/office/drawing/2016/5/9/chartex" xmlns:cx4="http://schemas.microsoft.com/office/drawing/2016/5/10/chartex" xmlns:cx5="http://schemas.microsoft.com/office/drawing/2016/5/11/chartex" xmlns:cx6="http://schemas.microsoft.com/office/drawing/2016/5/12/chartex" xmlns:cx7="http://schemas.microsoft.com/office/drawing/2016/5/13/chartex" xmlns:cx8="http://schemas.microsoft.com/office/drawing/2016/5/14/chartex" xmlns:mc="http://schemas.openxmlformats.org/markup-compatibility/2006" xmlns:aink="http://schemas.microsoft.com/office/drawing/2016/ink" xmlns:am3d="http://schemas.microsoft.com/office/drawing/2017/model3d" xmlns:o="urn:schemas-microsoft-com:office:office" xmlns:r="http://schemas.openxmlformats.org/officeDocument/2006/relationships" xmlns:m="http://schemas.openxmlformats.org/officeDocument/2006/math" xmlns:v="urn:schemas-microsoft-com:vml" xmlns:wp14="http://schemas.microsoft.com/office/word/2010/wordprocessingDrawing" xmlns:wp="http://schemas.openxmlformats.org/drawingml/2006/wordprocessingDrawing" xmlns:w10="urn:schemas-microsoft-com:office:word" xmlns:w="http://schemas.openxmlformats.org/wordprocessingml/2006/main" xmlns:w14="http://schemas.microsoft.com/office/word/2010/wordml" xmlns:w15="http://schemas.microsoft.com/office/word/2012/wordml" xmlns:w16cid="http://schemas.microsoft.com/office/word/2016/wordml/cid" xmlns:w16se="http://schemas.microsoft.com/office/word/2015/wordml/symex" xmlns:wpg="http://schemas.microsoft.com/office/word/2010/wordprocessingGroup" xmlns:wpi="http://schemas.microsoft.com/office/word/2010/wordprocessingInk" xmlns:wne="http://schemas.microsoft.com/office/word/2006/wordml" xmlns:wps="http://schemas.microsoft.com/office/word/2010/wordprocessingShape" mc:Ignorable="w14 w15 w16se w16cid wp14">
+<w:hdr xmlns:wpc="http://schemas.microsoft.com/office/word/2010/wordprocessingCanvas" xmlns:cx="http://schemas.microsoft.com/office/drawing/2014/chartex" xmlns:cx1="http://schemas.microsoft.com/office/drawing/2015/9/8/chartex" xmlns:cx2="http://schemas.microsoft.com/office/drawing/2015/10/21/chartex" xmlns:cx3="http://schemas.microsoft.com/office/drawing/2016/5/9/chartex" xmlns:cx4="http://schemas.microsoft.com/office/drawing/2016/5/10/chartex" xmlns:cx5="http://schemas.microsoft.com/office/drawing/2016/5/11/chartex" xmlns:cx6="http://schemas.microsoft.com/office/drawing/2016/5/12/chartex" xmlns:cx7="http://schemas.microsoft.com/office/drawing/2016/5/13/chartex" xmlns:cx8="http://schemas.microsoft.com/office/drawing/2016/5/14/chartex" xmlns:mc="http://schemas.openxmlformats.org/markup-compatibility/2006" xmlns:aink="http://schemas.microsoft.com/office/drawing/2016/ink" xmlns:am3d="http://schemas.microsoft.com/office/drawing/2017/model3d" xmlns:o="urn:schemas-microsoft-com:office:office" xmlns:oel="http://schemas.microsoft.com/office/2019/extlst" xmlns:r="http://schemas.openxmlformats.org/officeDocument/2006/relationships" xmlns:m="http://schemas.openxmlformats.org/officeDocument/2006/math" xmlns:v="urn:schemas-microsoft-com:vml" xmlns:wp14="http://schemas.microsoft.com/office/word/2010/wordprocessingDrawing" xmlns:wp="http://schemas.openxmlformats.org/drawingml/2006/wordprocessingDrawing" xmlns:w10="urn:schemas-microsoft-com:office:word" xmlns:w="http://schemas.openxmlformats.org/wordprocessingml/2006/main" xmlns:w14="http://schemas.microsoft.com/office/word/2010/wordml" xmlns:w15="http://schemas.microsoft.com/office/word/2012/wordml" xmlns:w16cex="http://schemas.microsoft.com/office/word/2018/wordml/cex" xmlns:w16cid="http://schemas.microsoft.com/office/word/2016/wordml/cid" xmlns:w16="http://schemas.microsoft.com/office/word/2018/wordml" xmlns:w16du="http://schemas.microsoft.com/office/word/2023/wordml/word16du" xmlns:w16sdtdh="http://schemas.microsoft.com/office/word/2020/wordml/sdtdatahash" xmlns:w16sdtfl="http://schemas.microsoft.com/office/word/2024/wordml/sdtformatlock" xmlns:w16se="http://schemas.microsoft.com/office/word/2015/wordml/symex" xmlns:wpg="http://schemas.microsoft.com/office/word/2010/wordprocessingGroup" xmlns:wpi="http://schemas.microsoft.com/office/word/2010/wordprocessingInk" xmlns:wne="http://schemas.microsoft.com/office/word/2006/wordml" xmlns:wps="http://schemas.microsoft.com/office/word/2010/wordprocessingShape" mc:Ignorable="w14 w15 w16se w16cid w16 w16cex w16sdtdh w16sdtfl w16du wp14">
   <w:p>
     <w:pPr>
       <w:pStyle w:val="En-tte"/>
@@ -1809,7 +1807,7 @@
 </file>
 
 <file path=word/numbering.xml><?xml version="1.0" encoding="utf-8"?>
-<w:numbering xmlns:wpc="http://schemas.microsoft.com/office/word/2010/wordprocessingCanvas" xmlns:cx="http://schemas.microsoft.com/office/drawing/2014/chartex" xmlns:cx1="http://schemas.microsoft.com/office/drawing/2015/9/8/chartex" xmlns:cx2="http://schemas.microsoft.com/office/drawing/2015/10/21/chartex" xmlns:cx3="http://schemas.microsoft.com/office/drawing/2016/5/9/chartex" xmlns:cx4="http://schemas.microsoft.com/office/drawing/2016/5/10/chartex" xmlns:cx5="http://schemas.microsoft.com/office/drawing/2016/5/11/chartex" xmlns:cx6="http://schemas.microsoft.com/office/drawing/2016/5/12/chartex" xmlns:cx7="http://schemas.microsoft.com/office/drawing/2016/5/13/chartex" xmlns:cx8="http://schemas.microsoft.com/office/drawing/2016/5/14/chartex" xmlns:mc="http://schemas.openxmlformats.org/markup-compatibility/2006" xmlns:aink="http://schemas.microsoft.com/office/drawing/2016/ink" xmlns:am3d="http://schemas.microsoft.com/office/drawing/2017/model3d" xmlns:o="urn:schemas-microsoft-com:office:office" xmlns:r="http://schemas.openxmlformats.org/officeDocument/2006/relationships" xmlns:m="http://schemas.openxmlformats.org/officeDocument/2006/math" xmlns:v="urn:schemas-microsoft-com:vml" xmlns:wp14="http://schemas.microsoft.com/office/word/2010/wordprocessingDrawing" xmlns:wp="http://schemas.openxmlformats.org/drawingml/2006/wordprocessingDrawing" xmlns:w10="urn:schemas-microsoft-com:office:word" xmlns:w="http://schemas.openxmlformats.org/wordprocessingml/2006/main" xmlns:w14="http://schemas.microsoft.com/office/word/2010/wordml" xmlns:w15="http://schemas.microsoft.com/office/word/2012/wordml" xmlns:w16cid="http://schemas.microsoft.com/office/word/2016/wordml/cid" xmlns:w16se="http://schemas.microsoft.com/office/word/2015/wordml/symex" xmlns:wpg="http://schemas.microsoft.com/office/word/2010/wordprocessingGroup" xmlns:wpi="http://schemas.microsoft.com/office/word/2010/wordprocessingInk" xmlns:wne="http://schemas.microsoft.com/office/word/2006/wordml" xmlns:wps="http://schemas.microsoft.com/office/word/2010/wordprocessingShape" mc:Ignorable="w14 w15 w16se w16cid wp14">
+<w:numbering xmlns:wpc="http://schemas.microsoft.com/office/word/2010/wordprocessingCanvas" xmlns:cx="http://schemas.microsoft.com/office/drawing/2014/chartex" xmlns:cx1="http://schemas.microsoft.com/office/drawing/2015/9/8/chartex" xmlns:cx2="http://schemas.microsoft.com/office/drawing/2015/10/21/chartex" xmlns:cx3="http://schemas.microsoft.com/office/drawing/2016/5/9/chartex" xmlns:cx4="http://schemas.microsoft.com/office/drawing/2016/5/10/chartex" xmlns:cx5="http://schemas.microsoft.com/office/drawing/2016/5/11/chartex" xmlns:cx6="http://schemas.microsoft.com/office/drawing/2016/5/12/chartex" xmlns:cx7="http://schemas.microsoft.com/office/drawing/2016/5/13/chartex" xmlns:cx8="http://schemas.microsoft.com/office/drawing/2016/5/14/chartex" xmlns:mc="http://schemas.openxmlformats.org/markup-compatibility/2006" xmlns:aink="http://schemas.microsoft.com/office/drawing/2016/ink" xmlns:am3d="http://schemas.microsoft.com/office/drawing/2017/model3d" xmlns:o="urn:schemas-microsoft-com:office:office" xmlns:oel="http://schemas.microsoft.com/office/2019/extlst" xmlns:r="http://schemas.openxmlformats.org/officeDocument/2006/relationships" xmlns:m="http://schemas.openxmlformats.org/officeDocument/2006/math" xmlns:v="urn:schemas-microsoft-com:vml" xmlns:wp14="http://schemas.microsoft.com/office/word/2010/wordprocessingDrawing" xmlns:wp="http://schemas.openxmlformats.org/drawingml/2006/wordprocessingDrawing" xmlns:w10="urn:schemas-microsoft-com:office:word" xmlns:w="http://schemas.openxmlformats.org/wordprocessingml/2006/main" xmlns:w14="http://schemas.microsoft.com/office/word/2010/wordml" xmlns:w15="http://schemas.microsoft.com/office/word/2012/wordml" xmlns:w16cex="http://schemas.microsoft.com/office/word/2018/wordml/cex" xmlns:w16cid="http://schemas.microsoft.com/office/word/2016/wordml/cid" xmlns:w16="http://schemas.microsoft.com/office/word/2018/wordml" xmlns:w16du="http://schemas.microsoft.com/office/word/2023/wordml/word16du" xmlns:w16sdtdh="http://schemas.microsoft.com/office/word/2020/wordml/sdtdatahash" xmlns:w16sdtfl="http://schemas.microsoft.com/office/word/2024/wordml/sdtformatlock" xmlns:w16se="http://schemas.microsoft.com/office/word/2015/wordml/symex" xmlns:wpg="http://schemas.microsoft.com/office/word/2010/wordprocessingGroup" xmlns:wpi="http://schemas.microsoft.com/office/word/2010/wordprocessingInk" xmlns:wne="http://schemas.microsoft.com/office/word/2006/wordml" xmlns:wps="http://schemas.microsoft.com/office/word/2010/wordprocessingShape" mc:Ignorable="w14 w15 w16se w16cid w16 w16cex w16sdtdh w16sdtfl w16du wp14">
   <w:abstractNum w:abstractNumId="0" w15:restartNumberingAfterBreak="0">
     <w:nsid w:val="28D11AA4"/>
     <w:multiLevelType w:val="hybridMultilevel"/>
@@ -2483,26 +2481,26 @@
       </w:rPr>
     </w:lvl>
   </w:abstractNum>
-  <w:num w:numId="1">
+  <w:num w:numId="1" w16cid:durableId="1264456847">
     <w:abstractNumId w:val="3"/>
   </w:num>
-  <w:num w:numId="2">
+  <w:num w:numId="2" w16cid:durableId="822739482">
     <w:abstractNumId w:val="2"/>
   </w:num>
-  <w:num w:numId="3">
+  <w:num w:numId="3" w16cid:durableId="1901015307">
     <w:abstractNumId w:val="1"/>
   </w:num>
-  <w:num w:numId="4">
+  <w:num w:numId="4" w16cid:durableId="1892307884">
     <w:abstractNumId w:val="4"/>
   </w:num>
-  <w:num w:numId="5">
+  <w:num w:numId="5" w16cid:durableId="1762987362">
     <w:abstractNumId w:val="0"/>
   </w:num>
 </w:numbering>
 </file>
 
 <file path=word/styles.xml><?xml version="1.0" encoding="utf-8"?>
-<w:styles xmlns:mc="http://schemas.openxmlformats.org/markup-compatibility/2006" xmlns:r="http://schemas.openxmlformats.org/officeDocument/2006/relationships" xmlns:w="http://schemas.openxmlformats.org/wordprocessingml/2006/main" xmlns:w14="http://schemas.microsoft.com/office/word/2010/wordml" xmlns:w15="http://schemas.microsoft.com/office/word/2012/wordml" xmlns:w16cid="http://schemas.microsoft.com/office/word/2016/wordml/cid" xmlns:w16se="http://schemas.microsoft.com/office/word/2015/wordml/symex" mc:Ignorable="w14 w15 w16se w16cid">
+<w:styles xmlns:mc="http://schemas.openxmlformats.org/markup-compatibility/2006" xmlns:r="http://schemas.openxmlformats.org/officeDocument/2006/relationships" xmlns:w="http://schemas.openxmlformats.org/wordprocessingml/2006/main" xmlns:w14="http://schemas.microsoft.com/office/word/2010/wordml" xmlns:w15="http://schemas.microsoft.com/office/word/2012/wordml" xmlns:w16cex="http://schemas.microsoft.com/office/word/2018/wordml/cex" xmlns:w16cid="http://schemas.microsoft.com/office/word/2016/wordml/cid" xmlns:w16="http://schemas.microsoft.com/office/word/2018/wordml" xmlns:w16du="http://schemas.microsoft.com/office/word/2023/wordml/word16du" xmlns:w16sdtdh="http://schemas.microsoft.com/office/word/2020/wordml/sdtdatahash" xmlns:w16sdtfl="http://schemas.microsoft.com/office/word/2024/wordml/sdtformatlock" xmlns:w16se="http://schemas.microsoft.com/office/word/2015/wordml/symex" mc:Ignorable="w14 w15 w16se w16cid w16 w16cex w16sdtdh w16sdtfl w16du">
   <w:docDefaults>
     <w:rPrDefault>
       <w:rPr>
@@ -2512,7 +2510,7 @@
     </w:rPrDefault>
     <w:pPrDefault/>
   </w:docDefaults>
-  <w:latentStyles w:defLockedState="0" w:defUIPriority="99" w:defSemiHidden="0" w:defUnhideWhenUsed="0" w:defQFormat="0" w:count="375">
+  <w:latentStyles w:defLockedState="0" w:defUIPriority="99" w:defSemiHidden="0" w:defUnhideWhenUsed="0" w:defQFormat="0" w:count="376">
     <w:lsdException w:name="Normal" w:uiPriority="0" w:qFormat="1"/>
     <w:lsdException w:name="heading 1" w:uiPriority="9" w:qFormat="1"/>
     <w:lsdException w:name="heading 2" w:semiHidden="1" w:uiPriority="9" w:unhideWhenUsed="1" w:qFormat="1"/>
@@ -2885,10 +2883,12 @@
     <w:lsdException w:name="Smart Hyperlink" w:semiHidden="1" w:unhideWhenUsed="1"/>
     <w:lsdException w:name="Hashtag" w:semiHidden="1" w:unhideWhenUsed="1"/>
     <w:lsdException w:name="Unresolved Mention" w:semiHidden="1" w:unhideWhenUsed="1"/>
+    <w:lsdException w:name="Smart Link" w:semiHidden="1" w:unhideWhenUsed="1"/>
   </w:latentStyles>
   <w:style w:type="paragraph" w:default="1" w:styleId="Normal">
     <w:name w:val="Normal"/>
     <w:qFormat/>
+    <w:rsid w:val="00557F77"/>
     <w:pPr>
       <w:widowControl w:val="0"/>
       <w:autoSpaceDE w:val="0"/>

</xml_diff>